<commit_message>
docs: categorize resume skills
</commit_message>
<xml_diff>
--- a/public/resume/Howard_Sun-Resume-2026.docx
+++ b/public/resume/Howard_Sun-Resume-2026.docx
@@ -407,274 +407,110 @@
         </w:rPr>
         <w:t>Languages:</w:t>
       </w:r>
-      <w:r>
-        <w:rPr>
-          <w:rFonts w:ascii="Aptos" w:hAnsi="Aptos"/>
-          <w:sz w:val="16"/>
-          <w:szCs w:val="16"/>
-        </w:rPr>
-        <w:t xml:space="preserve"> TypeScript, JavaScript (ES6), Python</w:t>
-      </w:r>
-      <w:r>
-        <w:rPr>
-          <w:rFonts w:ascii="Aptos" w:hAnsi="Aptos"/>
-          <w:sz w:val="16"/>
-          <w:szCs w:val="16"/>
-        </w:rPr>
-        <w:t xml:space="preserve"> </w:t>
-      </w:r>
-      <w:r>
-        <w:rPr>
-          <w:rFonts w:ascii="Aptos" w:hAnsi="Aptos"/>
-          <w:sz w:val="16"/>
-          <w:szCs w:val="16"/>
-        </w:rPr>
+      <w:proofErr w:type="spellStart"/>
+      <w:proofErr w:type="spellEnd"/>
+      <w:proofErr w:type="spellStart"/>
+      <w:proofErr w:type="spellEnd"/>
+      <w:proofErr w:type="spellStart"/>
+      <w:proofErr w:type="spellEnd"/>
+      <w:proofErr w:type="spellStart"/>
+      <w:proofErr w:type="spellEnd"/>
+      <w:r>
+        <w:rPr>
+          <w:b w:val="0"/>
+        </w:rPr>
+        <w:t xml:space="preserve"> TypeScript, JavaScript (ES6), Python, C++</w:t>
+      </w:r>
+      <w:r>
         <w:br/>
       </w:r>
       <w:r>
         <w:rPr>
-          <w:rFonts w:ascii="Aptos" w:hAnsi="Aptos"/>
           <w:b/>
-          <w:bCs/>
-          <w:sz w:val="16"/>
-          <w:szCs w:val="16"/>
         </w:rPr>
         <w:t>Frontend:</w:t>
       </w:r>
       <w:r>
         <w:rPr>
-          <w:rFonts w:ascii="Aptos" w:hAnsi="Aptos"/>
-          <w:sz w:val="16"/>
-          <w:szCs w:val="16"/>
-        </w:rPr>
-        <w:t xml:space="preserve"> React, Redux, </w:t>
-      </w:r>
-      <w:proofErr w:type="spellStart"/>
-      <w:r>
-        <w:rPr>
-          <w:rFonts w:ascii="Aptos" w:hAnsi="Aptos"/>
-          <w:sz w:val="16"/>
-          <w:szCs w:val="16"/>
-        </w:rPr>
-        <w:t>Zustand</w:t>
-      </w:r>
-      <w:proofErr w:type="spellEnd"/>
-      <w:r>
-        <w:rPr>
-          <w:rFonts w:ascii="Aptos" w:hAnsi="Aptos"/>
-          <w:sz w:val="16"/>
-          <w:szCs w:val="16"/>
-        </w:rPr>
-        <w:t xml:space="preserve">, HTML5, CSS (Sass), Tailwind CSS, Material UI, </w:t>
-      </w:r>
-      <w:proofErr w:type="spellStart"/>
-      <w:r>
-        <w:rPr>
-          <w:rFonts w:ascii="Aptos" w:hAnsi="Aptos"/>
-          <w:sz w:val="16"/>
-          <w:szCs w:val="16"/>
-        </w:rPr>
-        <w:t>DaisyUI</w:t>
-      </w:r>
-      <w:proofErr w:type="spellEnd"/>
-      <w:r>
-        <w:rPr>
-          <w:rFonts w:ascii="Aptos" w:hAnsi="Aptos"/>
-          <w:sz w:val="16"/>
-          <w:szCs w:val="16"/>
-        </w:rPr>
-        <w:t>, Solid.js, Electron.js, webpack, Vite</w:t>
-      </w:r>
-      <w:r>
-        <w:rPr>
-          <w:rFonts w:ascii="Aptos" w:hAnsi="Aptos"/>
-          <w:sz w:val="16"/>
-          <w:szCs w:val="16"/>
-        </w:rPr>
-        <w:t xml:space="preserve"> </w:t>
-      </w:r>
-      <w:r>
-        <w:rPr>
-          <w:rFonts w:ascii="Aptos" w:hAnsi="Aptos"/>
-          <w:sz w:val="16"/>
-          <w:szCs w:val="16"/>
-        </w:rPr>
+          <w:b w:val="0"/>
+        </w:rPr>
+        <w:t xml:space="preserve"> React, Redux, Zustand, HTML5, CSS3/Sass, Tailwind CSS, Material UI, DaisyUI, Solid.js, React Router, TanStack Router, Vite, webpack</w:t>
+      </w:r>
+      <w:r>
         <w:br/>
       </w:r>
       <w:r>
         <w:rPr>
-          <w:rFonts w:ascii="Aptos" w:hAnsi="Aptos"/>
           <w:b/>
-          <w:bCs/>
-          <w:sz w:val="16"/>
-          <w:szCs w:val="16"/>
-        </w:rPr>
-        <w:t>Backend:</w:t>
-      </w:r>
-      <w:r>
-        <w:rPr>
-          <w:rFonts w:ascii="Aptos" w:hAnsi="Aptos"/>
-          <w:sz w:val="16"/>
-          <w:szCs w:val="16"/>
-        </w:rPr>
-        <w:t xml:space="preserve"> Node.js, Express, WebSocket</w:t>
-      </w:r>
-      <w:r>
-        <w:rPr>
-          <w:rFonts w:ascii="Aptos" w:hAnsi="Aptos"/>
-          <w:sz w:val="16"/>
-          <w:szCs w:val="16"/>
-        </w:rPr>
-        <w:t xml:space="preserve"> </w:t>
-      </w:r>
-      <w:r>
-        <w:rPr>
-          <w:rFonts w:ascii="Aptos" w:hAnsi="Aptos"/>
-          <w:sz w:val="16"/>
-          <w:szCs w:val="16"/>
-        </w:rPr>
+        </w:rPr>
+        <w:t>Backend &amp; APIs:</w:t>
+      </w:r>
+      <w:r>
+        <w:rPr>
+          <w:b w:val="0"/>
+        </w:rPr>
+        <w:t xml:space="preserve"> Node.js, Express, WebSocket, Socket.IO, REST APIs, JWT/Auth, Cloudinary, Arcjet</w:t>
+      </w:r>
+      <w:r>
         <w:br/>
       </w:r>
       <w:r>
         <w:rPr>
-          <w:rFonts w:ascii="Aptos" w:hAnsi="Aptos"/>
           <w:b/>
-          <w:bCs/>
-          <w:sz w:val="16"/>
-          <w:szCs w:val="16"/>
+        </w:rPr>
+        <w:t>Desktop &amp; Tooling:</w:t>
+      </w:r>
+      <w:r>
+        <w:rPr>
+          <w:b w:val="0"/>
+        </w:rPr>
+        <w:t xml:space="preserve"> Electron, electron-builder, CLI tools, Git</w:t>
+      </w:r>
+      <w:r>
+        <w:br/>
+      </w:r>
+      <w:r>
+        <w:rPr>
+          <w:b/>
         </w:rPr>
         <w:t>Databases:</w:t>
       </w:r>
       <w:r>
         <w:rPr>
-          <w:rFonts w:ascii="Aptos" w:hAnsi="Aptos"/>
-          <w:sz w:val="16"/>
-          <w:szCs w:val="16"/>
-        </w:rPr>
-        <w:t xml:space="preserve"> PostgreSQL, MongoDB</w:t>
-      </w:r>
-      <w:r>
-        <w:rPr>
-          <w:rFonts w:ascii="Aptos" w:hAnsi="Aptos"/>
-          <w:sz w:val="16"/>
-          <w:szCs w:val="16"/>
-        </w:rPr>
-        <w:t xml:space="preserve"> </w:t>
-      </w:r>
-      <w:r>
-        <w:rPr>
-          <w:rFonts w:ascii="Aptos" w:hAnsi="Aptos"/>
-          <w:sz w:val="16"/>
-          <w:szCs w:val="16"/>
-        </w:rPr>
+          <w:b w:val="0"/>
+        </w:rPr>
+        <w:t xml:space="preserve"> PostgreSQL, MongoDB, Amazon Aurora</w:t>
+      </w:r>
+      <w:r>
         <w:br/>
       </w:r>
       <w:r>
         <w:rPr>
-          <w:rFonts w:ascii="Aptos" w:hAnsi="Aptos"/>
           <w:b/>
-          <w:bCs/>
-          <w:sz w:val="16"/>
-          <w:szCs w:val="16"/>
-        </w:rPr>
-        <w:t>Infrastructure &amp; Cloud:</w:t>
-      </w:r>
-      <w:r>
-        <w:rPr>
-          <w:rFonts w:ascii="Aptos" w:hAnsi="Aptos"/>
-          <w:sz w:val="16"/>
-          <w:szCs w:val="16"/>
-        </w:rPr>
-        <w:t xml:space="preserve"> AWS (EC2, S3, Aurora, Elastic Beanstalk, VPC), Docker, Kubernetes, GitHub Actions</w:t>
-      </w:r>
-      <w:r>
-        <w:rPr>
-          <w:rFonts w:ascii="Aptos" w:hAnsi="Aptos"/>
-          <w:sz w:val="16"/>
-          <w:szCs w:val="16"/>
-        </w:rPr>
-        <w:t xml:space="preserve"> </w:t>
-      </w:r>
-      <w:r>
-        <w:rPr>
-          <w:rFonts w:ascii="Aptos" w:hAnsi="Aptos"/>
-          <w:sz w:val="16"/>
-          <w:szCs w:val="16"/>
-        </w:rPr>
+        </w:rPr>
+        <w:t>Cloud &amp; DevOps:</w:t>
+      </w:r>
+      <w:r>
+        <w:rPr>
+          <w:b w:val="0"/>
+        </w:rPr>
+        <w:t xml:space="preserve"> AWS EC2, AWS S3, AWS Elastic Beanstalk, AWS VPC, CloudFront, ELB/ALB, Docker, Kubernetes, GitHub Actions</w:t>
+      </w:r>
+      <w:r>
         <w:br/>
       </w:r>
       <w:r>
         <w:rPr>
-          <w:rFonts w:ascii="Aptos" w:hAnsi="Aptos"/>
           <w:b/>
-          <w:bCs/>
-          <w:sz w:val="16"/>
-          <w:szCs w:val="16"/>
         </w:rPr>
         <w:t>Testing:</w:t>
       </w:r>
       <w:r>
         <w:rPr>
-          <w:rFonts w:ascii="Aptos" w:hAnsi="Aptos"/>
-          <w:sz w:val="16"/>
-          <w:szCs w:val="16"/>
-        </w:rPr>
-        <w:t xml:space="preserve"> Jest, Playwright, Mocha, Chai, </w:t>
-      </w:r>
-      <w:proofErr w:type="spellStart"/>
-      <w:r>
-        <w:rPr>
-          <w:rFonts w:ascii="Aptos" w:hAnsi="Aptos"/>
-          <w:sz w:val="16"/>
-          <w:szCs w:val="16"/>
-        </w:rPr>
-        <w:t>Vitest</w:t>
-      </w:r>
-      <w:proofErr w:type="spellEnd"/>
-      <w:r>
-        <w:rPr>
-          <w:rFonts w:ascii="Aptos" w:hAnsi="Aptos"/>
-          <w:sz w:val="16"/>
-          <w:szCs w:val="16"/>
-        </w:rPr>
-        <w:t xml:space="preserve"> </w:t>
-      </w:r>
-      <w:r>
-        <w:rPr>
-          <w:rFonts w:ascii="Aptos" w:hAnsi="Aptos"/>
-          <w:sz w:val="16"/>
-          <w:szCs w:val="16"/>
-        </w:rPr>
-        <w:br/>
-      </w:r>
-      <w:r>
-        <w:rPr>
-          <w:rFonts w:ascii="Aptos" w:hAnsi="Aptos"/>
-          <w:b/>
-          <w:bCs/>
-          <w:sz w:val="16"/>
-          <w:szCs w:val="16"/>
-        </w:rPr>
-        <w:t>Tools:</w:t>
-      </w:r>
-      <w:r>
-        <w:rPr>
-          <w:rFonts w:ascii="Aptos" w:hAnsi="Aptos"/>
-          <w:sz w:val="16"/>
-          <w:szCs w:val="16"/>
-        </w:rPr>
-        <w:t xml:space="preserve"> Git, </w:t>
-      </w:r>
-      <w:proofErr w:type="spellStart"/>
-      <w:r>
-        <w:rPr>
-          <w:rFonts w:ascii="Aptos" w:hAnsi="Aptos"/>
-          <w:sz w:val="16"/>
-          <w:szCs w:val="16"/>
-        </w:rPr>
-        <w:t>Cloudinary</w:t>
-      </w:r>
-      <w:proofErr w:type="spellEnd"/>
+          <w:b w:val="0"/>
+        </w:rPr>
+        <w:t xml:space="preserve"> Jest, Playwright, Mocha, Chai, Vitest</w:t>
+      </w:r>
     </w:p>
     <w:p>
       <w:pPr>

</xml_diff>

<commit_message>
docs: align tech stack with resume skills (#54)
* docs: align tech stack with resume skills

* docs: categorize resume skills

---------

Co-authored-by: Howard Sun <howardsun@pm.me>
</commit_message>
<xml_diff>
--- a/public/resume/Howard_Sun-Resume-2026.docx
+++ b/public/resume/Howard_Sun-Resume-2026.docx
@@ -407,274 +407,110 @@
         </w:rPr>
         <w:t>Languages:</w:t>
       </w:r>
-      <w:r>
-        <w:rPr>
-          <w:rFonts w:ascii="Aptos" w:hAnsi="Aptos"/>
-          <w:sz w:val="16"/>
-          <w:szCs w:val="16"/>
-        </w:rPr>
-        <w:t xml:space="preserve"> TypeScript, JavaScript (ES6), Python</w:t>
-      </w:r>
-      <w:r>
-        <w:rPr>
-          <w:rFonts w:ascii="Aptos" w:hAnsi="Aptos"/>
-          <w:sz w:val="16"/>
-          <w:szCs w:val="16"/>
-        </w:rPr>
-        <w:t xml:space="preserve"> </w:t>
-      </w:r>
-      <w:r>
-        <w:rPr>
-          <w:rFonts w:ascii="Aptos" w:hAnsi="Aptos"/>
-          <w:sz w:val="16"/>
-          <w:szCs w:val="16"/>
-        </w:rPr>
+      <w:proofErr w:type="spellStart"/>
+      <w:proofErr w:type="spellEnd"/>
+      <w:proofErr w:type="spellStart"/>
+      <w:proofErr w:type="spellEnd"/>
+      <w:proofErr w:type="spellStart"/>
+      <w:proofErr w:type="spellEnd"/>
+      <w:proofErr w:type="spellStart"/>
+      <w:proofErr w:type="spellEnd"/>
+      <w:r>
+        <w:rPr>
+          <w:b w:val="0"/>
+        </w:rPr>
+        <w:t xml:space="preserve"> TypeScript, JavaScript (ES6), Python, C++</w:t>
+      </w:r>
+      <w:r>
         <w:br/>
       </w:r>
       <w:r>
         <w:rPr>
-          <w:rFonts w:ascii="Aptos" w:hAnsi="Aptos"/>
           <w:b/>
-          <w:bCs/>
-          <w:sz w:val="16"/>
-          <w:szCs w:val="16"/>
         </w:rPr>
         <w:t>Frontend:</w:t>
       </w:r>
       <w:r>
         <w:rPr>
-          <w:rFonts w:ascii="Aptos" w:hAnsi="Aptos"/>
-          <w:sz w:val="16"/>
-          <w:szCs w:val="16"/>
-        </w:rPr>
-        <w:t xml:space="preserve"> React, Redux, </w:t>
-      </w:r>
-      <w:proofErr w:type="spellStart"/>
-      <w:r>
-        <w:rPr>
-          <w:rFonts w:ascii="Aptos" w:hAnsi="Aptos"/>
-          <w:sz w:val="16"/>
-          <w:szCs w:val="16"/>
-        </w:rPr>
-        <w:t>Zustand</w:t>
-      </w:r>
-      <w:proofErr w:type="spellEnd"/>
-      <w:r>
-        <w:rPr>
-          <w:rFonts w:ascii="Aptos" w:hAnsi="Aptos"/>
-          <w:sz w:val="16"/>
-          <w:szCs w:val="16"/>
-        </w:rPr>
-        <w:t xml:space="preserve">, HTML5, CSS (Sass), Tailwind CSS, Material UI, </w:t>
-      </w:r>
-      <w:proofErr w:type="spellStart"/>
-      <w:r>
-        <w:rPr>
-          <w:rFonts w:ascii="Aptos" w:hAnsi="Aptos"/>
-          <w:sz w:val="16"/>
-          <w:szCs w:val="16"/>
-        </w:rPr>
-        <w:t>DaisyUI</w:t>
-      </w:r>
-      <w:proofErr w:type="spellEnd"/>
-      <w:r>
-        <w:rPr>
-          <w:rFonts w:ascii="Aptos" w:hAnsi="Aptos"/>
-          <w:sz w:val="16"/>
-          <w:szCs w:val="16"/>
-        </w:rPr>
-        <w:t>, Solid.js, Electron.js, webpack, Vite</w:t>
-      </w:r>
-      <w:r>
-        <w:rPr>
-          <w:rFonts w:ascii="Aptos" w:hAnsi="Aptos"/>
-          <w:sz w:val="16"/>
-          <w:szCs w:val="16"/>
-        </w:rPr>
-        <w:t xml:space="preserve"> </w:t>
-      </w:r>
-      <w:r>
-        <w:rPr>
-          <w:rFonts w:ascii="Aptos" w:hAnsi="Aptos"/>
-          <w:sz w:val="16"/>
-          <w:szCs w:val="16"/>
-        </w:rPr>
+          <w:b w:val="0"/>
+        </w:rPr>
+        <w:t xml:space="preserve"> React, Redux, Zustand, HTML5, CSS3/Sass, Tailwind CSS, Material UI, DaisyUI, Solid.js, React Router, TanStack Router, Vite, webpack</w:t>
+      </w:r>
+      <w:r>
         <w:br/>
       </w:r>
       <w:r>
         <w:rPr>
-          <w:rFonts w:ascii="Aptos" w:hAnsi="Aptos"/>
           <w:b/>
-          <w:bCs/>
-          <w:sz w:val="16"/>
-          <w:szCs w:val="16"/>
-        </w:rPr>
-        <w:t>Backend:</w:t>
-      </w:r>
-      <w:r>
-        <w:rPr>
-          <w:rFonts w:ascii="Aptos" w:hAnsi="Aptos"/>
-          <w:sz w:val="16"/>
-          <w:szCs w:val="16"/>
-        </w:rPr>
-        <w:t xml:space="preserve"> Node.js, Express, WebSocket</w:t>
-      </w:r>
-      <w:r>
-        <w:rPr>
-          <w:rFonts w:ascii="Aptos" w:hAnsi="Aptos"/>
-          <w:sz w:val="16"/>
-          <w:szCs w:val="16"/>
-        </w:rPr>
-        <w:t xml:space="preserve"> </w:t>
-      </w:r>
-      <w:r>
-        <w:rPr>
-          <w:rFonts w:ascii="Aptos" w:hAnsi="Aptos"/>
-          <w:sz w:val="16"/>
-          <w:szCs w:val="16"/>
-        </w:rPr>
+        </w:rPr>
+        <w:t>Backend &amp; APIs:</w:t>
+      </w:r>
+      <w:r>
+        <w:rPr>
+          <w:b w:val="0"/>
+        </w:rPr>
+        <w:t xml:space="preserve"> Node.js, Express, WebSocket, Socket.IO, REST APIs, JWT/Auth, Cloudinary, Arcjet</w:t>
+      </w:r>
+      <w:r>
         <w:br/>
       </w:r>
       <w:r>
         <w:rPr>
-          <w:rFonts w:ascii="Aptos" w:hAnsi="Aptos"/>
           <w:b/>
-          <w:bCs/>
-          <w:sz w:val="16"/>
-          <w:szCs w:val="16"/>
+        </w:rPr>
+        <w:t>Desktop &amp; Tooling:</w:t>
+      </w:r>
+      <w:r>
+        <w:rPr>
+          <w:b w:val="0"/>
+        </w:rPr>
+        <w:t xml:space="preserve"> Electron, electron-builder, CLI tools, Git</w:t>
+      </w:r>
+      <w:r>
+        <w:br/>
+      </w:r>
+      <w:r>
+        <w:rPr>
+          <w:b/>
         </w:rPr>
         <w:t>Databases:</w:t>
       </w:r>
       <w:r>
         <w:rPr>
-          <w:rFonts w:ascii="Aptos" w:hAnsi="Aptos"/>
-          <w:sz w:val="16"/>
-          <w:szCs w:val="16"/>
-        </w:rPr>
-        <w:t xml:space="preserve"> PostgreSQL, MongoDB</w:t>
-      </w:r>
-      <w:r>
-        <w:rPr>
-          <w:rFonts w:ascii="Aptos" w:hAnsi="Aptos"/>
-          <w:sz w:val="16"/>
-          <w:szCs w:val="16"/>
-        </w:rPr>
-        <w:t xml:space="preserve"> </w:t>
-      </w:r>
-      <w:r>
-        <w:rPr>
-          <w:rFonts w:ascii="Aptos" w:hAnsi="Aptos"/>
-          <w:sz w:val="16"/>
-          <w:szCs w:val="16"/>
-        </w:rPr>
+          <w:b w:val="0"/>
+        </w:rPr>
+        <w:t xml:space="preserve"> PostgreSQL, MongoDB, Amazon Aurora</w:t>
+      </w:r>
+      <w:r>
         <w:br/>
       </w:r>
       <w:r>
         <w:rPr>
-          <w:rFonts w:ascii="Aptos" w:hAnsi="Aptos"/>
           <w:b/>
-          <w:bCs/>
-          <w:sz w:val="16"/>
-          <w:szCs w:val="16"/>
-        </w:rPr>
-        <w:t>Infrastructure &amp; Cloud:</w:t>
-      </w:r>
-      <w:r>
-        <w:rPr>
-          <w:rFonts w:ascii="Aptos" w:hAnsi="Aptos"/>
-          <w:sz w:val="16"/>
-          <w:szCs w:val="16"/>
-        </w:rPr>
-        <w:t xml:space="preserve"> AWS (EC2, S3, Aurora, Elastic Beanstalk, VPC), Docker, Kubernetes, GitHub Actions</w:t>
-      </w:r>
-      <w:r>
-        <w:rPr>
-          <w:rFonts w:ascii="Aptos" w:hAnsi="Aptos"/>
-          <w:sz w:val="16"/>
-          <w:szCs w:val="16"/>
-        </w:rPr>
-        <w:t xml:space="preserve"> </w:t>
-      </w:r>
-      <w:r>
-        <w:rPr>
-          <w:rFonts w:ascii="Aptos" w:hAnsi="Aptos"/>
-          <w:sz w:val="16"/>
-          <w:szCs w:val="16"/>
-        </w:rPr>
+        </w:rPr>
+        <w:t>Cloud &amp; DevOps:</w:t>
+      </w:r>
+      <w:r>
+        <w:rPr>
+          <w:b w:val="0"/>
+        </w:rPr>
+        <w:t xml:space="preserve"> AWS EC2, AWS S3, AWS Elastic Beanstalk, AWS VPC, CloudFront, ELB/ALB, Docker, Kubernetes, GitHub Actions</w:t>
+      </w:r>
+      <w:r>
         <w:br/>
       </w:r>
       <w:r>
         <w:rPr>
-          <w:rFonts w:ascii="Aptos" w:hAnsi="Aptos"/>
           <w:b/>
-          <w:bCs/>
-          <w:sz w:val="16"/>
-          <w:szCs w:val="16"/>
         </w:rPr>
         <w:t>Testing:</w:t>
       </w:r>
       <w:r>
         <w:rPr>
-          <w:rFonts w:ascii="Aptos" w:hAnsi="Aptos"/>
-          <w:sz w:val="16"/>
-          <w:szCs w:val="16"/>
-        </w:rPr>
-        <w:t xml:space="preserve"> Jest, Playwright, Mocha, Chai, </w:t>
-      </w:r>
-      <w:proofErr w:type="spellStart"/>
-      <w:r>
-        <w:rPr>
-          <w:rFonts w:ascii="Aptos" w:hAnsi="Aptos"/>
-          <w:sz w:val="16"/>
-          <w:szCs w:val="16"/>
-        </w:rPr>
-        <w:t>Vitest</w:t>
-      </w:r>
-      <w:proofErr w:type="spellEnd"/>
-      <w:r>
-        <w:rPr>
-          <w:rFonts w:ascii="Aptos" w:hAnsi="Aptos"/>
-          <w:sz w:val="16"/>
-          <w:szCs w:val="16"/>
-        </w:rPr>
-        <w:t xml:space="preserve"> </w:t>
-      </w:r>
-      <w:r>
-        <w:rPr>
-          <w:rFonts w:ascii="Aptos" w:hAnsi="Aptos"/>
-          <w:sz w:val="16"/>
-          <w:szCs w:val="16"/>
-        </w:rPr>
-        <w:br/>
-      </w:r>
-      <w:r>
-        <w:rPr>
-          <w:rFonts w:ascii="Aptos" w:hAnsi="Aptos"/>
-          <w:b/>
-          <w:bCs/>
-          <w:sz w:val="16"/>
-          <w:szCs w:val="16"/>
-        </w:rPr>
-        <w:t>Tools:</w:t>
-      </w:r>
-      <w:r>
-        <w:rPr>
-          <w:rFonts w:ascii="Aptos" w:hAnsi="Aptos"/>
-          <w:sz w:val="16"/>
-          <w:szCs w:val="16"/>
-        </w:rPr>
-        <w:t xml:space="preserve"> Git, </w:t>
-      </w:r>
-      <w:proofErr w:type="spellStart"/>
-      <w:r>
-        <w:rPr>
-          <w:rFonts w:ascii="Aptos" w:hAnsi="Aptos"/>
-          <w:sz w:val="16"/>
-          <w:szCs w:val="16"/>
-        </w:rPr>
-        <w:t>Cloudinary</w:t>
-      </w:r>
-      <w:proofErr w:type="spellEnd"/>
+          <w:b w:val="0"/>
+        </w:rPr>
+        <w:t xml:space="preserve"> Jest, Playwright, Mocha, Chai, Vitest</w:t>
+      </w:r>
     </w:p>
     <w:p>
       <w:pPr>

</xml_diff>

<commit_message>
docs: updated resume and tag line (#56)
* updated skills list

* updated tag

* Add files via upload

* updated speed of stagger

---------

Co-authored-by: Howard Sun <howardsun@pm.me>
</commit_message>
<xml_diff>
--- a/public/resume/Howard_Sun-Resume-2026.docx
+++ b/public/resume/Howard_Sun-Resume-2026.docx
@@ -172,7 +172,7 @@
         <w:t xml:space="preserve"> </w:t>
       </w:r>
       <w:r>
-        <w:t xml:space="preserve">                       </w:t>
+        <w:t xml:space="preserve">                      </w:t>
       </w:r>
       <w:hyperlink r:id="rId7" w:history="1">
         <w:r>
@@ -182,7 +182,40 @@
             <w:sz w:val="16"/>
             <w:szCs w:val="16"/>
           </w:rPr>
-          <w:t>github.com/</w:t>
+          <w:t>howardsun.me</w:t>
+        </w:r>
+      </w:hyperlink>
+      <w:r>
+        <w:t xml:space="preserve"> </w:t>
+      </w:r>
+      <w:r>
+        <w:rPr>
+          <w:rFonts w:ascii="Aptos" w:hAnsi="Aptos"/>
+          <w:sz w:val="16"/>
+          <w:szCs w:val="16"/>
+        </w:rPr>
+        <w:t xml:space="preserve">| </w:t>
+      </w:r>
+      <w:hyperlink r:id="rId8" w:history="1">
+        <w:proofErr w:type="spellStart"/>
+        <w:r>
+          <w:rPr>
+            <w:rStyle w:val="Hyperlink"/>
+            <w:rFonts w:ascii="Aptos" w:hAnsi="Aptos"/>
+            <w:sz w:val="16"/>
+            <w:szCs w:val="16"/>
+          </w:rPr>
+          <w:t>github</w:t>
+        </w:r>
+        <w:proofErr w:type="spellEnd"/>
+        <w:r>
+          <w:rPr>
+            <w:rStyle w:val="Hyperlink"/>
+            <w:rFonts w:ascii="Aptos" w:hAnsi="Aptos"/>
+            <w:sz w:val="16"/>
+            <w:szCs w:val="16"/>
+          </w:rPr>
+          <w:t>/</w:t>
         </w:r>
         <w:proofErr w:type="spellStart"/>
         <w:r>
@@ -230,7 +263,7 @@
         </w:rPr>
         <w:t xml:space="preserve"> </w:t>
       </w:r>
-      <w:hyperlink r:id="rId8" w:history="1">
+      <w:hyperlink r:id="rId9" w:history="1">
         <w:proofErr w:type="spellStart"/>
         <w:r>
           <w:rPr>
@@ -337,25 +370,7 @@
           <w:sz w:val="16"/>
           <w:szCs w:val="16"/>
         </w:rPr>
-        <w:t xml:space="preserve">Full-stack software engineer </w:t>
-      </w:r>
-      <w:proofErr w:type="gramStart"/>
-      <w:r>
-        <w:rPr>
-          <w:rFonts w:ascii="Aptos" w:hAnsi="Aptos"/>
-          <w:sz w:val="16"/>
-          <w:szCs w:val="16"/>
-        </w:rPr>
-        <w:t>focused</w:t>
-      </w:r>
-      <w:proofErr w:type="gramEnd"/>
-      <w:r>
-        <w:rPr>
-          <w:rFonts w:ascii="Aptos" w:hAnsi="Aptos"/>
-          <w:sz w:val="16"/>
-          <w:szCs w:val="16"/>
-        </w:rPr>
-        <w:t xml:space="preserve"> on building reliable, well-tested applications with TypeScript, React, Node.js, and modern web tooling. Recent experience contributing to Swell, an open-source API testing platform, with work spanning security hardening, test infrastructure, Redux modernization, and frontend architecture. Previously co-founded and led engineering for a children’s coding education platform, building production systems across AWS, Node.js, TypeScript, and database infrastructure.</w:t>
+        <w:t>Full-stack software engineer focused on building reliable, well-tested applications with TypeScript, React, Node.js, and modern web tooling. Recent experience contributing to Swell, an open-source API testing platform, with work spanning security hardening, test infrastructure, Redux modernization, and frontend architecture. Previously co-founded and led engineering for a children’s coding education platform, building production systems across AWS, Node.js, TypeScript, and database infrastructure.</w:t>
       </w:r>
       <w:r>
         <w:rPr>
@@ -407,109 +422,459 @@
         </w:rPr>
         <w:t>Languages:</w:t>
       </w:r>
+      <w:r>
+        <w:rPr>
+          <w:rFonts w:ascii="Aptos" w:hAnsi="Aptos"/>
+          <w:sz w:val="16"/>
+          <w:szCs w:val="16"/>
+        </w:rPr>
+        <w:t xml:space="preserve"> TypeScript, JavaScript (ES6), Python</w:t>
+      </w:r>
+      <w:r>
+        <w:rPr>
+          <w:rFonts w:ascii="Aptos" w:hAnsi="Aptos"/>
+          <w:sz w:val="16"/>
+          <w:szCs w:val="16"/>
+        </w:rPr>
+        <w:t>, C++</w:t>
+      </w:r>
+      <w:r>
+        <w:rPr>
+          <w:rFonts w:ascii="Aptos" w:hAnsi="Aptos"/>
+          <w:sz w:val="16"/>
+          <w:szCs w:val="16"/>
+        </w:rPr>
+        <w:br/>
+      </w:r>
+      <w:r>
+        <w:rPr>
+          <w:rFonts w:ascii="Aptos" w:hAnsi="Aptos"/>
+          <w:b/>
+          <w:bCs/>
+          <w:sz w:val="16"/>
+          <w:szCs w:val="16"/>
+        </w:rPr>
+        <w:t>Frontend:</w:t>
+      </w:r>
+      <w:r>
+        <w:rPr>
+          <w:rFonts w:ascii="Aptos" w:hAnsi="Aptos"/>
+          <w:sz w:val="16"/>
+          <w:szCs w:val="16"/>
+        </w:rPr>
+        <w:t xml:space="preserve"> React, Redux</w:t>
+      </w:r>
+      <w:r>
+        <w:rPr>
+          <w:rFonts w:ascii="Aptos" w:hAnsi="Aptos"/>
+          <w:sz w:val="16"/>
+          <w:szCs w:val="16"/>
+        </w:rPr>
+        <w:t xml:space="preserve"> Toolkit</w:t>
+      </w:r>
+      <w:r>
+        <w:rPr>
+          <w:rFonts w:ascii="Aptos" w:hAnsi="Aptos"/>
+          <w:sz w:val="16"/>
+          <w:szCs w:val="16"/>
+        </w:rPr>
+        <w:t xml:space="preserve">, </w:t>
+      </w:r>
       <w:proofErr w:type="spellStart"/>
+      <w:r>
+        <w:rPr>
+          <w:rFonts w:ascii="Aptos" w:hAnsi="Aptos"/>
+          <w:sz w:val="16"/>
+          <w:szCs w:val="16"/>
+        </w:rPr>
+        <w:t>Zustand</w:t>
+      </w:r>
       <w:proofErr w:type="spellEnd"/>
+      <w:r>
+        <w:rPr>
+          <w:rFonts w:ascii="Aptos" w:hAnsi="Aptos"/>
+          <w:sz w:val="16"/>
+          <w:szCs w:val="16"/>
+        </w:rPr>
+        <w:t>,</w:t>
+      </w:r>
+      <w:r>
+        <w:rPr>
+          <w:rFonts w:ascii="Aptos" w:hAnsi="Aptos"/>
+          <w:sz w:val="16"/>
+          <w:szCs w:val="16"/>
+        </w:rPr>
+        <w:t xml:space="preserve"> </w:t>
+      </w:r>
       <w:proofErr w:type="spellStart"/>
+      <w:r>
+        <w:rPr>
+          <w:rFonts w:ascii="Aptos" w:hAnsi="Aptos"/>
+          <w:sz w:val="16"/>
+          <w:szCs w:val="16"/>
+        </w:rPr>
+        <w:t>TanStack</w:t>
+      </w:r>
       <w:proofErr w:type="spellEnd"/>
+      <w:r>
+        <w:rPr>
+          <w:rFonts w:ascii="Aptos" w:hAnsi="Aptos"/>
+          <w:sz w:val="16"/>
+          <w:szCs w:val="16"/>
+        </w:rPr>
+        <w:t xml:space="preserve"> Router, React Router,</w:t>
+      </w:r>
+      <w:r>
+        <w:rPr>
+          <w:rFonts w:ascii="Aptos" w:hAnsi="Aptos"/>
+          <w:sz w:val="16"/>
+          <w:szCs w:val="16"/>
+        </w:rPr>
+        <w:t xml:space="preserve"> HTML5, CSS</w:t>
+      </w:r>
+      <w:r>
+        <w:rPr>
+          <w:rFonts w:ascii="Aptos" w:hAnsi="Aptos"/>
+          <w:sz w:val="16"/>
+          <w:szCs w:val="16"/>
+        </w:rPr>
+        <w:t>3</w:t>
+      </w:r>
+      <w:r>
+        <w:rPr>
+          <w:rFonts w:ascii="Aptos" w:hAnsi="Aptos"/>
+          <w:sz w:val="16"/>
+          <w:szCs w:val="16"/>
+        </w:rPr>
+        <w:t xml:space="preserve"> (Sass), Tailwind CSS, Material UI, </w:t>
+      </w:r>
       <w:proofErr w:type="spellStart"/>
+      <w:r>
+        <w:rPr>
+          <w:rFonts w:ascii="Aptos" w:hAnsi="Aptos"/>
+          <w:sz w:val="16"/>
+          <w:szCs w:val="16"/>
+        </w:rPr>
+        <w:t>DaisyUI</w:t>
+      </w:r>
       <w:proofErr w:type="spellEnd"/>
+      <w:r>
+        <w:rPr>
+          <w:rFonts w:ascii="Aptos" w:hAnsi="Aptos"/>
+          <w:sz w:val="16"/>
+          <w:szCs w:val="16"/>
+        </w:rPr>
+        <w:t>, Chart.js</w:t>
+      </w:r>
+      <w:r>
+        <w:rPr>
+          <w:rFonts w:ascii="Aptos" w:hAnsi="Aptos"/>
+          <w:sz w:val="16"/>
+          <w:szCs w:val="16"/>
+        </w:rPr>
+        <w:t>, webpack, Vite</w:t>
+      </w:r>
+      <w:r>
+        <w:rPr>
+          <w:rFonts w:ascii="Aptos" w:hAnsi="Aptos"/>
+          <w:sz w:val="16"/>
+          <w:szCs w:val="16"/>
+        </w:rPr>
+        <w:t xml:space="preserve"> </w:t>
+      </w:r>
+      <w:r>
+        <w:rPr>
+          <w:rFonts w:ascii="Aptos" w:hAnsi="Aptos"/>
+          <w:sz w:val="16"/>
+          <w:szCs w:val="16"/>
+        </w:rPr>
+        <w:br/>
+      </w:r>
+      <w:r>
+        <w:rPr>
+          <w:rFonts w:ascii="Aptos" w:hAnsi="Aptos"/>
+          <w:b/>
+          <w:bCs/>
+          <w:sz w:val="16"/>
+          <w:szCs w:val="16"/>
+        </w:rPr>
+        <w:t>Backend:</w:t>
+      </w:r>
+      <w:r>
+        <w:rPr>
+          <w:rFonts w:ascii="Aptos" w:hAnsi="Aptos"/>
+          <w:sz w:val="16"/>
+          <w:szCs w:val="16"/>
+        </w:rPr>
+        <w:t xml:space="preserve"> Node.js, Express, </w:t>
+      </w:r>
+      <w:r>
+        <w:rPr>
+          <w:rFonts w:ascii="Aptos" w:hAnsi="Aptos"/>
+          <w:sz w:val="16"/>
+          <w:szCs w:val="16"/>
+        </w:rPr>
+        <w:t>WebSocket, Socket.IO</w:t>
+      </w:r>
+      <w:r>
+        <w:rPr>
+          <w:rFonts w:ascii="Aptos" w:hAnsi="Aptos"/>
+          <w:sz w:val="16"/>
+          <w:szCs w:val="16"/>
+        </w:rPr>
+        <w:t>, REST APIs</w:t>
+      </w:r>
+      <w:r>
+        <w:rPr>
+          <w:rFonts w:ascii="Aptos" w:hAnsi="Aptos"/>
+          <w:sz w:val="16"/>
+          <w:szCs w:val="16"/>
+        </w:rPr>
+        <w:t xml:space="preserve">, JWT/Auth, </w:t>
+      </w:r>
       <w:proofErr w:type="spellStart"/>
+      <w:r>
+        <w:rPr>
+          <w:rFonts w:ascii="Aptos" w:hAnsi="Aptos"/>
+          <w:sz w:val="16"/>
+          <w:szCs w:val="16"/>
+        </w:rPr>
+        <w:t>Cloundinary</w:t>
+      </w:r>
       <w:proofErr w:type="spellEnd"/>
       <w:r>
         <w:rPr>
-          <w:b w:val="0"/>
-        </w:rPr>
-        <w:t xml:space="preserve"> TypeScript, JavaScript (ES6), Python, C++</w:t>
-      </w:r>
-      <w:r>
+          <w:rFonts w:ascii="Aptos" w:hAnsi="Aptos"/>
+          <w:sz w:val="16"/>
+          <w:szCs w:val="16"/>
+        </w:rPr>
+        <w:t xml:space="preserve">, </w:t>
+      </w:r>
+      <w:proofErr w:type="spellStart"/>
+      <w:r>
+        <w:rPr>
+          <w:rFonts w:ascii="Aptos" w:hAnsi="Aptos"/>
+          <w:sz w:val="16"/>
+          <w:szCs w:val="16"/>
+        </w:rPr>
+        <w:t>Arcjet</w:t>
+      </w:r>
+      <w:proofErr w:type="spellEnd"/>
+      <w:r>
+        <w:rPr>
+          <w:rFonts w:ascii="Aptos" w:hAnsi="Aptos"/>
+          <w:sz w:val="16"/>
+          <w:szCs w:val="16"/>
+        </w:rPr>
         <w:br/>
       </w:r>
       <w:r>
         <w:rPr>
+          <w:rFonts w:ascii="Aptos" w:hAnsi="Aptos"/>
           <w:b/>
-        </w:rPr>
-        <w:t>Frontend:</w:t>
-      </w:r>
-      <w:r>
-        <w:rPr>
-          <w:b w:val="0"/>
-        </w:rPr>
-        <w:t xml:space="preserve"> React, Redux, Zustand, HTML5, CSS3/Sass, Tailwind CSS, Material UI, DaisyUI, Solid.js, React Router, TanStack Router, Vite, webpack</w:t>
-      </w:r>
-      <w:r>
+          <w:bCs/>
+          <w:sz w:val="16"/>
+          <w:szCs w:val="16"/>
+        </w:rPr>
+        <w:t xml:space="preserve">Desktop &amp; </w:t>
+      </w:r>
+      <w:r>
+        <w:rPr>
+          <w:rFonts w:ascii="Aptos" w:hAnsi="Aptos"/>
+          <w:b/>
+          <w:bCs/>
+          <w:sz w:val="16"/>
+          <w:szCs w:val="16"/>
+        </w:rPr>
+        <w:t>Tool</w:t>
+      </w:r>
+      <w:r>
+        <w:rPr>
+          <w:rFonts w:ascii="Aptos" w:hAnsi="Aptos"/>
+          <w:b/>
+          <w:bCs/>
+          <w:sz w:val="16"/>
+          <w:szCs w:val="16"/>
+        </w:rPr>
+        <w:t>ing</w:t>
+      </w:r>
+      <w:r>
+        <w:rPr>
+          <w:rFonts w:ascii="Aptos" w:hAnsi="Aptos"/>
+          <w:b/>
+          <w:bCs/>
+          <w:sz w:val="16"/>
+          <w:szCs w:val="16"/>
+        </w:rPr>
+        <w:t>:</w:t>
+      </w:r>
+      <w:r>
+        <w:rPr>
+          <w:rFonts w:ascii="Aptos" w:hAnsi="Aptos"/>
+          <w:sz w:val="16"/>
+          <w:szCs w:val="16"/>
+        </w:rPr>
+        <w:t xml:space="preserve"> </w:t>
+      </w:r>
+      <w:r>
+        <w:rPr>
+          <w:rFonts w:ascii="Aptos" w:hAnsi="Aptos"/>
+          <w:sz w:val="16"/>
+          <w:szCs w:val="16"/>
+        </w:rPr>
+        <w:t xml:space="preserve">Electron, electron-builder, </w:t>
+      </w:r>
+      <w:r>
+        <w:rPr>
+          <w:rFonts w:ascii="Aptos" w:hAnsi="Aptos"/>
+          <w:sz w:val="16"/>
+          <w:szCs w:val="16"/>
+        </w:rPr>
+        <w:t>CLI tools, Git</w:t>
+      </w:r>
+      <w:r>
+        <w:rPr>
+          <w:rFonts w:ascii="Aptos" w:hAnsi="Aptos"/>
+          <w:sz w:val="16"/>
+          <w:szCs w:val="16"/>
+        </w:rPr>
+        <w:t>, Figma</w:t>
+      </w:r>
+      <w:r>
+        <w:rPr>
+          <w:rFonts w:ascii="Aptos" w:hAnsi="Aptos"/>
+          <w:sz w:val="16"/>
+          <w:szCs w:val="16"/>
+        </w:rPr>
         <w:br/>
       </w:r>
       <w:r>
         <w:rPr>
+          <w:rFonts w:ascii="Aptos" w:hAnsi="Aptos"/>
           <w:b/>
-        </w:rPr>
-        <w:t>Backend &amp; APIs:</w:t>
-      </w:r>
-      <w:r>
-        <w:rPr>
-          <w:b w:val="0"/>
-        </w:rPr>
-        <w:t xml:space="preserve"> Node.js, Express, WebSocket, Socket.IO, REST APIs, JWT/Auth, Cloudinary, Arcjet</w:t>
-      </w:r>
-      <w:r>
+          <w:bCs/>
+          <w:sz w:val="16"/>
+          <w:szCs w:val="16"/>
+        </w:rPr>
+        <w:t>Databases:</w:t>
+      </w:r>
+      <w:r>
+        <w:rPr>
+          <w:rFonts w:ascii="Aptos" w:hAnsi="Aptos"/>
+          <w:sz w:val="16"/>
+          <w:szCs w:val="16"/>
+        </w:rPr>
+        <w:t xml:space="preserve"> PostgreSQL, MongoDB</w:t>
+      </w:r>
+      <w:r>
+        <w:rPr>
+          <w:rFonts w:ascii="Aptos" w:hAnsi="Aptos"/>
+          <w:sz w:val="16"/>
+          <w:szCs w:val="16"/>
+        </w:rPr>
+        <w:t xml:space="preserve"> </w:t>
+      </w:r>
+      <w:r>
+        <w:rPr>
+          <w:rFonts w:ascii="Aptos" w:hAnsi="Aptos"/>
+          <w:sz w:val="16"/>
+          <w:szCs w:val="16"/>
+        </w:rPr>
+        <w:t>, Amazon Aurora</w:t>
+      </w:r>
+      <w:r>
+        <w:rPr>
+          <w:rFonts w:ascii="Aptos" w:hAnsi="Aptos"/>
+          <w:sz w:val="16"/>
+          <w:szCs w:val="16"/>
+        </w:rPr>
         <w:br/>
       </w:r>
       <w:r>
         <w:rPr>
+          <w:rFonts w:ascii="Aptos" w:hAnsi="Aptos"/>
           <w:b/>
-        </w:rPr>
-        <w:t>Desktop &amp; Tooling:</w:t>
-      </w:r>
-      <w:r>
-        <w:rPr>
-          <w:b w:val="0"/>
-        </w:rPr>
-        <w:t xml:space="preserve"> Electron, electron-builder, CLI tools, Git</w:t>
-      </w:r>
-      <w:r>
+          <w:bCs/>
+          <w:sz w:val="16"/>
+          <w:szCs w:val="16"/>
+        </w:rPr>
+        <w:t>Infrastructure &amp; Cloud:</w:t>
+      </w:r>
+      <w:r>
+        <w:rPr>
+          <w:rFonts w:ascii="Aptos" w:hAnsi="Aptos"/>
+          <w:sz w:val="16"/>
+          <w:szCs w:val="16"/>
+        </w:rPr>
+        <w:t xml:space="preserve"> AWS</w:t>
+      </w:r>
+      <w:r>
+        <w:rPr>
+          <w:rFonts w:ascii="Aptos" w:hAnsi="Aptos"/>
+          <w:sz w:val="16"/>
+          <w:szCs w:val="16"/>
+        </w:rPr>
+        <w:t xml:space="preserve"> EC2, AWS S3, AWS Elastic Beanstalk, AWS VPC, CloudFront, ELB/ALB</w:t>
+      </w:r>
+      <w:r>
+        <w:rPr>
+          <w:rFonts w:ascii="Aptos" w:hAnsi="Aptos"/>
+          <w:sz w:val="16"/>
+          <w:szCs w:val="16"/>
+        </w:rPr>
+        <w:t>, Docker, GitHub Actions</w:t>
+      </w:r>
+      <w:r>
+        <w:rPr>
+          <w:rFonts w:ascii="Aptos" w:hAnsi="Aptos"/>
+          <w:sz w:val="16"/>
+          <w:szCs w:val="16"/>
+        </w:rPr>
+        <w:t xml:space="preserve"> </w:t>
+      </w:r>
+      <w:r>
+        <w:rPr>
+          <w:rFonts w:ascii="Aptos" w:hAnsi="Aptos"/>
+          <w:sz w:val="16"/>
+          <w:szCs w:val="16"/>
+        </w:rPr>
         <w:br/>
       </w:r>
       <w:r>
         <w:rPr>
+          <w:rFonts w:ascii="Aptos" w:hAnsi="Aptos"/>
           <w:b/>
-        </w:rPr>
-        <w:t>Databases:</w:t>
-      </w:r>
-      <w:r>
-        <w:rPr>
-          <w:b w:val="0"/>
-        </w:rPr>
-        <w:t xml:space="preserve"> PostgreSQL, MongoDB, Amazon Aurora</w:t>
-      </w:r>
-      <w:r>
-        <w:br/>
-      </w:r>
-      <w:r>
-        <w:rPr>
-          <w:b/>
-        </w:rPr>
-        <w:t>Cloud &amp; DevOps:</w:t>
-      </w:r>
-      <w:r>
-        <w:rPr>
-          <w:b w:val="0"/>
-        </w:rPr>
-        <w:t xml:space="preserve"> AWS EC2, AWS S3, AWS Elastic Beanstalk, AWS VPC, CloudFront, ELB/ALB, Docker, Kubernetes, GitHub Actions</w:t>
-      </w:r>
-      <w:r>
-        <w:br/>
-      </w:r>
-      <w:r>
-        <w:rPr>
-          <w:b/>
+          <w:bCs/>
+          <w:sz w:val="16"/>
+          <w:szCs w:val="16"/>
         </w:rPr>
         <w:t>Testing:</w:t>
       </w:r>
       <w:r>
         <w:rPr>
-          <w:b w:val="0"/>
-        </w:rPr>
-        <w:t xml:space="preserve"> Jest, Playwright, Mocha, Chai, Vitest</w:t>
+          <w:rFonts w:ascii="Aptos" w:hAnsi="Aptos"/>
+          <w:sz w:val="16"/>
+          <w:szCs w:val="16"/>
+        </w:rPr>
+        <w:t xml:space="preserve"> Jest, Playwright, Mocha, Chai, </w:t>
+      </w:r>
+      <w:proofErr w:type="spellStart"/>
+      <w:r>
+        <w:rPr>
+          <w:rFonts w:ascii="Aptos" w:hAnsi="Aptos"/>
+          <w:sz w:val="16"/>
+          <w:szCs w:val="16"/>
+        </w:rPr>
+        <w:t>Vitest</w:t>
+      </w:r>
+      <w:proofErr w:type="spellEnd"/>
+      <w:r>
+        <w:rPr>
+          <w:rFonts w:ascii="Aptos" w:hAnsi="Aptos"/>
+          <w:sz w:val="16"/>
+          <w:szCs w:val="16"/>
+        </w:rPr>
+        <w:t xml:space="preserve"> </w:t>
       </w:r>
     </w:p>
     <w:p>
@@ -947,25 +1312,7 @@
           <w:sz w:val="16"/>
           <w:szCs w:val="16"/>
         </w:rPr>
-        <w:t xml:space="preserve">Transitioned from an </w:t>
-      </w:r>
-      <w:proofErr w:type="gramStart"/>
-      <w:r>
-        <w:rPr>
-          <w:rFonts w:ascii="Aptos" w:hAnsi="Aptos"/>
-          <w:sz w:val="16"/>
-          <w:szCs w:val="16"/>
-        </w:rPr>
-        <w:t>on-premise</w:t>
-      </w:r>
-      <w:proofErr w:type="gramEnd"/>
-      <w:r>
-        <w:rPr>
-          <w:rFonts w:ascii="Aptos" w:hAnsi="Aptos"/>
-          <w:sz w:val="16"/>
-          <w:szCs w:val="16"/>
-        </w:rPr>
-        <w:t xml:space="preserve"> monolithic server to a scalable AWS infrastructure with Elastic Load Balancing (ELB-ALB) and Elastic Compute Cloud (EC2), reducing resource overhead by 40%, enabling auto-scaling based on traffic patterns, and improving reliability and cost-efficiency across multiple regions</w:t>
+        <w:t>Transitioned from an on-premise monolithic server to a scalable AWS infrastructure with Elastic Load Balancing (ELB-ALB) and Elastic Compute Cloud (EC2), reducing resource overhead by 40%, enabling auto-scaling based on traffic patterns, and improving reliability and cost-efficiency across multiple regions</w:t>
       </w:r>
     </w:p>
     <w:p>
@@ -1205,162 +1552,6 @@
     </w:p>
     <w:p>
       <w:pPr>
-        <w:pStyle w:val="ListParagraph"/>
-        <w:numPr>
-          <w:ilvl w:val="0"/>
-          <w:numId w:val="6"/>
-        </w:numPr>
-        <w:spacing w:line="259" w:lineRule="auto"/>
-        <w:ind w:left="270" w:hanging="180"/>
-        <w:rPr>
-          <w:rFonts w:ascii="Aptos" w:hAnsi="Aptos" w:cstheme="minorHAnsi"/>
-          <w:sz w:val="16"/>
-          <w:szCs w:val="16"/>
-        </w:rPr>
-      </w:pPr>
-      <w:proofErr w:type="gramStart"/>
-      <w:r>
-        <w:rPr>
-          <w:rFonts w:ascii="Aptos" w:hAnsi="Aptos" w:cstheme="minorHAnsi"/>
-          <w:sz w:val="16"/>
-          <w:szCs w:val="16"/>
-        </w:rPr>
-        <w:t>Drove</w:t>
-      </w:r>
-      <w:proofErr w:type="gramEnd"/>
-      <w:r>
-        <w:rPr>
-          <w:rFonts w:ascii="Aptos" w:hAnsi="Aptos" w:cstheme="minorHAnsi"/>
-          <w:sz w:val="16"/>
-          <w:szCs w:val="16"/>
-        </w:rPr>
-        <w:t xml:space="preserve"> </w:t>
-      </w:r>
-      <w:r>
-        <w:rPr>
-          <w:rFonts w:ascii="Aptos" w:hAnsi="Aptos" w:cstheme="minorHAnsi"/>
-          <w:sz w:val="16"/>
-          <w:szCs w:val="16"/>
-        </w:rPr>
-        <w:t>SEO strategy by conducting keyword research, optimiz</w:t>
-      </w:r>
-      <w:r>
-        <w:rPr>
-          <w:rFonts w:ascii="Aptos" w:hAnsi="Aptos" w:cstheme="minorHAnsi"/>
-          <w:sz w:val="16"/>
-          <w:szCs w:val="16"/>
-        </w:rPr>
-        <w:t>ing</w:t>
-      </w:r>
-      <w:r>
-        <w:rPr>
-          <w:rFonts w:ascii="Aptos" w:hAnsi="Aptos" w:cstheme="minorHAnsi"/>
-          <w:sz w:val="16"/>
-          <w:szCs w:val="16"/>
-        </w:rPr>
-        <w:t xml:space="preserve"> on-page elements</w:t>
-      </w:r>
-      <w:r>
-        <w:rPr>
-          <w:rFonts w:ascii="Aptos" w:hAnsi="Aptos" w:cstheme="minorHAnsi"/>
-          <w:sz w:val="16"/>
-          <w:szCs w:val="16"/>
-        </w:rPr>
-        <w:t xml:space="preserve"> (</w:t>
-      </w:r>
-      <w:r>
-        <w:rPr>
-          <w:rFonts w:ascii="Aptos" w:hAnsi="Aptos" w:cstheme="minorHAnsi"/>
-          <w:sz w:val="16"/>
-          <w:szCs w:val="16"/>
-        </w:rPr>
-        <w:t>title tags, meta descriptions, header tags, content)</w:t>
-      </w:r>
-      <w:r>
-        <w:rPr>
-          <w:rFonts w:ascii="Aptos" w:hAnsi="Aptos" w:cstheme="minorHAnsi"/>
-          <w:sz w:val="16"/>
-          <w:szCs w:val="16"/>
-        </w:rPr>
-        <w:t xml:space="preserve">, and </w:t>
-      </w:r>
-      <w:proofErr w:type="gramStart"/>
-      <w:r>
-        <w:rPr>
-          <w:rFonts w:ascii="Aptos" w:hAnsi="Aptos" w:cstheme="minorHAnsi"/>
-          <w:sz w:val="16"/>
-          <w:szCs w:val="16"/>
-        </w:rPr>
-        <w:t>establish</w:t>
-      </w:r>
-      <w:r>
-        <w:rPr>
-          <w:rFonts w:ascii="Aptos" w:hAnsi="Aptos" w:cstheme="minorHAnsi"/>
-          <w:sz w:val="16"/>
-          <w:szCs w:val="16"/>
-        </w:rPr>
-        <w:t>ed</w:t>
-      </w:r>
-      <w:proofErr w:type="gramEnd"/>
-      <w:r>
-        <w:rPr>
-          <w:rFonts w:ascii="Aptos" w:hAnsi="Aptos" w:cstheme="minorHAnsi"/>
-          <w:sz w:val="16"/>
-          <w:szCs w:val="16"/>
-        </w:rPr>
-        <w:t xml:space="preserve"> an</w:t>
-      </w:r>
-      <w:r>
-        <w:rPr>
-          <w:rFonts w:ascii="Aptos" w:hAnsi="Aptos" w:cstheme="minorHAnsi"/>
-          <w:sz w:val="16"/>
-          <w:szCs w:val="16"/>
-        </w:rPr>
-        <w:t xml:space="preserve"> off-page backlink campaign</w:t>
-      </w:r>
-      <w:r>
-        <w:rPr>
-          <w:rFonts w:ascii="Aptos" w:hAnsi="Aptos" w:cstheme="minorHAnsi"/>
-          <w:sz w:val="16"/>
-          <w:szCs w:val="16"/>
-        </w:rPr>
-        <w:t xml:space="preserve"> </w:t>
-      </w:r>
-      <w:r>
-        <w:rPr>
-          <w:rFonts w:ascii="Aptos" w:hAnsi="Aptos" w:cstheme="minorHAnsi"/>
-          <w:sz w:val="16"/>
-          <w:szCs w:val="16"/>
-        </w:rPr>
-        <w:t>driving 35% organic traffic growth</w:t>
-      </w:r>
-    </w:p>
-    <w:p>
-      <w:pPr>
-        <w:pStyle w:val="ListParagraph"/>
-        <w:numPr>
-          <w:ilvl w:val="0"/>
-          <w:numId w:val="6"/>
-        </w:numPr>
-        <w:spacing w:line="259" w:lineRule="auto"/>
-        <w:ind w:left="270" w:hanging="180"/>
-        <w:rPr>
-          <w:rFonts w:ascii="Aptos" w:hAnsi="Aptos" w:cstheme="minorHAnsi"/>
-          <w:sz w:val="16"/>
-          <w:szCs w:val="16"/>
-        </w:rPr>
-      </w:pPr>
-      <w:r>
-        <w:rPr>
-          <w:rFonts w:ascii="Aptos" w:hAnsi="Aptos" w:cstheme="minorHAnsi"/>
-          <w:sz w:val="16"/>
-          <w:szCs w:val="16"/>
-        </w:rPr>
-        <w:t>Increased conversion rate by 5% through SEO efforts by monitoring performance via Google Analytics, contributing to revenue growth and business objectives</w:t>
-      </w:r>
-    </w:p>
-    <w:p>
-      <w:pPr>
         <w:pBdr>
           <w:bottom w:val="single" w:sz="6" w:space="1" w:color="auto"/>
         </w:pBdr>
@@ -1412,7 +1603,6 @@
           <w:lang w:eastAsia="ko-KR"/>
         </w:rPr>
       </w:pPr>
-      <w:proofErr w:type="spellStart"/>
       <w:r>
         <w:rPr>
           <w:rFonts w:ascii="Aptos" w:eastAsia="Malgun Gothic" w:hAnsi="Aptos" w:cstheme="minorHAnsi"/>
@@ -1422,9 +1612,8 @@
           <w:szCs w:val="16"/>
           <w:lang w:eastAsia="ko-KR"/>
         </w:rPr>
-        <w:t>QuickChat</w:t>
-      </w:r>
-      <w:proofErr w:type="spellEnd"/>
+        <w:t>LANShare (Web</w:t>
+      </w:r>
       <w:r>
         <w:rPr>
           <w:rFonts w:ascii="Aptos" w:eastAsia="Malgun Gothic" w:hAnsi="Aptos" w:cstheme="minorHAnsi"/>
@@ -1445,7 +1634,7 @@
           <w:szCs w:val="16"/>
           <w:lang w:eastAsia="ko-KR"/>
         </w:rPr>
-        <w:t>–</w:t>
+        <w:t>&amp; Electron</w:t>
       </w:r>
       <w:r>
         <w:rPr>
@@ -1456,7 +1645,16 @@
           <w:szCs w:val="16"/>
           <w:lang w:eastAsia="ko-KR"/>
         </w:rPr>
-        <w:t xml:space="preserve"> Real-time chat </w:t>
+        <w:t>)</w:t>
+      </w:r>
+      <w:r>
+        <w:rPr>
+          <w:rFonts w:ascii="Aptos" w:eastAsia="Malgun Gothic" w:hAnsi="Aptos" w:cstheme="minorHAnsi"/>
+          <w:sz w:val="16"/>
+          <w:szCs w:val="16"/>
+          <w:lang w:eastAsia="ko-KR"/>
+        </w:rPr>
+        <w:t xml:space="preserve"> |</w:t>
       </w:r>
       <w:r>
         <w:rPr>
@@ -1467,68 +1665,20 @@
           <w:szCs w:val="16"/>
           <w:lang w:eastAsia="ko-KR"/>
         </w:rPr>
-        <w:t>platform</w:t>
-      </w:r>
-      <w:r>
-        <w:rPr>
-          <w:rFonts w:ascii="Aptos" w:eastAsia="Malgun Gothic" w:hAnsi="Aptos" w:cstheme="minorHAnsi"/>
-          <w:b/>
-          <w:bCs/>
-          <w:sz w:val="16"/>
-          <w:szCs w:val="16"/>
-          <w:lang w:eastAsia="ko-KR"/>
-        </w:rPr>
         <w:t xml:space="preserve"> </w:t>
       </w:r>
-      <w:r>
-        <w:rPr>
-          <w:rFonts w:ascii="Aptos" w:hAnsi="Aptos"/>
-          <w:color w:val="000000"/>
-          <w:sz w:val="16"/>
-          <w:szCs w:val="16"/>
-        </w:rPr>
-        <w:t xml:space="preserve">| </w:t>
-      </w:r>
-      <w:r>
-        <w:rPr>
-          <w:rFonts w:ascii="Aptos" w:hAnsi="Aptos"/>
-          <w:color w:val="000000"/>
-          <w:sz w:val="16"/>
-          <w:szCs w:val="16"/>
-        </w:rPr>
-        <w:t>github.com/</w:t>
-      </w:r>
-      <w:proofErr w:type="spellStart"/>
-      <w:r>
-        <w:rPr>
-          <w:rFonts w:ascii="Aptos" w:hAnsi="Aptos"/>
-          <w:color w:val="000000"/>
-          <w:sz w:val="16"/>
-          <w:szCs w:val="16"/>
-        </w:rPr>
-        <w:t>howardsun</w:t>
-      </w:r>
-      <w:proofErr w:type="spellEnd"/>
-      <w:r>
-        <w:rPr>
-          <w:rFonts w:ascii="Aptos" w:hAnsi="Aptos"/>
-          <w:color w:val="000000"/>
-          <w:sz w:val="16"/>
-          <w:szCs w:val="16"/>
-        </w:rPr>
-        <w:t>-dev/</w:t>
-      </w:r>
-      <w:proofErr w:type="spellStart"/>
-      <w:r>
-        <w:rPr>
-          <w:rFonts w:ascii="Aptos" w:hAnsi="Aptos"/>
-          <w:color w:val="000000"/>
-          <w:sz w:val="16"/>
-          <w:szCs w:val="16"/>
-        </w:rPr>
-        <w:t>quickchat</w:t>
-      </w:r>
-      <w:proofErr w:type="spellEnd"/>
+      <w:hyperlink r:id="rId10" w:history="1">
+        <w:r>
+          <w:rPr>
+            <w:rStyle w:val="Hyperlink"/>
+            <w:rFonts w:ascii="Aptos" w:eastAsia="Malgun Gothic" w:hAnsi="Aptos" w:cstheme="minorHAnsi"/>
+            <w:sz w:val="16"/>
+            <w:szCs w:val="16"/>
+            <w:lang w:eastAsia="ko-KR"/>
+          </w:rPr>
+          <w:t>https://github.com/howardsun-dev/lanshare-electron</w:t>
+        </w:r>
+      </w:hyperlink>
     </w:p>
     <w:p>
       <w:pPr>
@@ -1548,132 +1698,102 @@
       </w:pPr>
       <w:r>
         <w:rPr>
-          <w:rFonts w:ascii="Aptos" w:eastAsia="Malgun Gothic" w:hAnsi="Aptos" w:cstheme="minorHAnsi"/>
-          <w:sz w:val="16"/>
-          <w:szCs w:val="16"/>
-          <w:lang w:eastAsia="ko-KR"/>
-        </w:rPr>
-        <w:t xml:space="preserve">Built a real-time messaging platform using React, Node.js/Express, MongoDB, and Socket.IO with authentication. Implemented </w:t>
-      </w:r>
-      <w:proofErr w:type="spellStart"/>
-      <w:r>
-        <w:rPr>
-          <w:rFonts w:ascii="Aptos" w:eastAsia="Malgun Gothic" w:hAnsi="Aptos" w:cstheme="minorHAnsi"/>
-          <w:sz w:val="16"/>
-          <w:szCs w:val="16"/>
-          <w:lang w:eastAsia="ko-KR"/>
-        </w:rPr>
-        <w:t>Zustand</w:t>
-      </w:r>
-      <w:proofErr w:type="spellEnd"/>
-      <w:r>
-        <w:rPr>
-          <w:rFonts w:ascii="Aptos" w:eastAsia="Malgun Gothic" w:hAnsi="Aptos" w:cstheme="minorHAnsi"/>
-          <w:sz w:val="16"/>
-          <w:szCs w:val="16"/>
-          <w:lang w:eastAsia="ko-KR"/>
-        </w:rPr>
-        <w:t xml:space="preserve"> for state management, optimistic UI updates, online/offline presence detection and secure media upload</w:t>
-      </w:r>
-      <w:r>
-        <w:rPr>
-          <w:rFonts w:ascii="Aptos" w:eastAsia="Malgun Gothic" w:hAnsi="Aptos" w:cstheme="minorHAnsi"/>
-          <w:sz w:val="16"/>
-          <w:szCs w:val="16"/>
-          <w:lang w:eastAsia="ko-KR"/>
-        </w:rPr>
-        <w:t>s</w:t>
-      </w:r>
-      <w:r>
-        <w:rPr>
-          <w:rFonts w:ascii="Aptos" w:eastAsia="Malgun Gothic" w:hAnsi="Aptos" w:cstheme="minorHAnsi"/>
-          <w:sz w:val="16"/>
-          <w:szCs w:val="16"/>
-          <w:lang w:eastAsia="ko-KR"/>
-        </w:rPr>
-        <w:t xml:space="preserve"> </w:t>
-      </w:r>
-      <w:r>
-        <w:rPr>
-          <w:rFonts w:ascii="Aptos" w:eastAsia="Malgun Gothic" w:hAnsi="Aptos" w:cstheme="minorHAnsi"/>
-          <w:sz w:val="16"/>
-          <w:szCs w:val="16"/>
-          <w:lang w:eastAsia="ko-KR"/>
-        </w:rPr>
-        <w:t xml:space="preserve">via </w:t>
-      </w:r>
-      <w:proofErr w:type="spellStart"/>
-      <w:r>
-        <w:rPr>
-          <w:rFonts w:ascii="Aptos" w:eastAsia="Malgun Gothic" w:hAnsi="Aptos" w:cstheme="minorHAnsi"/>
-          <w:sz w:val="16"/>
-          <w:szCs w:val="16"/>
-          <w:lang w:eastAsia="ko-KR"/>
-        </w:rPr>
-        <w:t>Cloudinary</w:t>
-      </w:r>
-      <w:proofErr w:type="spellEnd"/>
-      <w:r>
-        <w:rPr>
-          <w:rFonts w:ascii="Aptos" w:eastAsia="Malgun Gothic" w:hAnsi="Aptos" w:cstheme="minorHAnsi"/>
-          <w:sz w:val="16"/>
-          <w:szCs w:val="16"/>
-          <w:lang w:eastAsia="ko-KR"/>
-        </w:rPr>
-        <w:t xml:space="preserve">. Added request protection and rate limiting with </w:t>
-      </w:r>
-      <w:proofErr w:type="spellStart"/>
-      <w:r>
-        <w:rPr>
-          <w:rFonts w:ascii="Aptos" w:eastAsia="Malgun Gothic" w:hAnsi="Aptos" w:cstheme="minorHAnsi"/>
-          <w:sz w:val="16"/>
-          <w:szCs w:val="16"/>
-          <w:lang w:eastAsia="ko-KR"/>
-        </w:rPr>
-        <w:t>Arcjet</w:t>
-      </w:r>
-      <w:proofErr w:type="spellEnd"/>
-      <w:r>
-        <w:rPr>
-          <w:rFonts w:ascii="Aptos" w:eastAsia="Malgun Gothic" w:hAnsi="Aptos" w:cstheme="minorHAnsi"/>
-          <w:sz w:val="16"/>
-          <w:szCs w:val="16"/>
-          <w:lang w:eastAsia="ko-KR"/>
-        </w:rPr>
-        <w:t xml:space="preserve"> and built a responsive UI with Tailwind CSS and </w:t>
-      </w:r>
-      <w:proofErr w:type="spellStart"/>
-      <w:r>
-        <w:rPr>
-          <w:rFonts w:ascii="Aptos" w:eastAsia="Malgun Gothic" w:hAnsi="Aptos" w:cstheme="minorHAnsi"/>
-          <w:sz w:val="16"/>
-          <w:szCs w:val="16"/>
-          <w:lang w:eastAsia="ko-KR"/>
-        </w:rPr>
-        <w:t>DaisyUI</w:t>
-      </w:r>
-      <w:proofErr w:type="spellEnd"/>
+          <w:rFonts w:ascii="Aptos" w:eastAsia="Times New Roman" w:hAnsi="Aptos" w:cs="Arial"/>
+          <w:color w:val="000000"/>
+          <w:kern w:val="0"/>
+          <w:sz w:val="16"/>
+          <w:szCs w:val="16"/>
+          <w14:ligatures w14:val="none"/>
+        </w:rPr>
+        <w:t>Built a TypeScript/Node.js LAN file-sharing application with Electron and Express, featuring secure traversal-safe file serving, browser-based controls, CLI support, automated CI testing pipelines, and lightweight local-network deployment for trusted environments.</w:t>
+      </w:r>
     </w:p>
     <w:p>
       <w:pPr>
         <w:spacing w:line="259" w:lineRule="auto"/>
         <w:rPr>
-          <w:rFonts w:ascii="Aptos" w:hAnsi="Aptos"/>
-          <w:color w:val="000000"/>
-          <w:sz w:val="16"/>
-          <w:szCs w:val="16"/>
-        </w:rPr>
-      </w:pPr>
-      <w:r>
-        <w:rPr>
-          <w:rFonts w:ascii="Aptos" w:hAnsi="Aptos"/>
+          <w:rFonts w:ascii="Aptos" w:eastAsia="Malgun Gothic" w:hAnsi="Aptos" w:cstheme="minorHAnsi"/>
+          <w:sz w:val="16"/>
+          <w:szCs w:val="16"/>
+          <w:lang w:eastAsia="ko-KR"/>
+        </w:rPr>
+      </w:pPr>
+      <w:proofErr w:type="spellStart"/>
+      <w:r>
+        <w:rPr>
+          <w:rFonts w:ascii="Aptos" w:eastAsia="Malgun Gothic" w:hAnsi="Aptos" w:cstheme="minorHAnsi"/>
           <w:b/>
           <w:bCs/>
+          <w:sz w:val="16"/>
+          <w:szCs w:val="16"/>
+          <w:lang w:eastAsia="ko-KR"/>
+        </w:rPr>
+        <w:t>QuickChat</w:t>
+      </w:r>
+      <w:proofErr w:type="spellEnd"/>
+      <w:r>
+        <w:rPr>
+          <w:rFonts w:ascii="Aptos" w:eastAsia="Malgun Gothic" w:hAnsi="Aptos" w:cstheme="minorHAnsi"/>
+          <w:b/>
+          <w:bCs/>
+          <w:sz w:val="16"/>
+          <w:szCs w:val="16"/>
+          <w:lang w:eastAsia="ko-KR"/>
+        </w:rPr>
+        <w:t xml:space="preserve"> </w:t>
+      </w:r>
+      <w:r>
+        <w:rPr>
+          <w:rFonts w:ascii="Aptos" w:eastAsia="Malgun Gothic" w:hAnsi="Aptos" w:cstheme="minorHAnsi"/>
+          <w:b/>
+          <w:bCs/>
+          <w:sz w:val="16"/>
+          <w:szCs w:val="16"/>
+          <w:lang w:eastAsia="ko-KR"/>
+        </w:rPr>
+        <w:t>–</w:t>
+      </w:r>
+      <w:r>
+        <w:rPr>
+          <w:rFonts w:ascii="Aptos" w:eastAsia="Malgun Gothic" w:hAnsi="Aptos" w:cstheme="minorHAnsi"/>
+          <w:b/>
+          <w:bCs/>
+          <w:sz w:val="16"/>
+          <w:szCs w:val="16"/>
+          <w:lang w:eastAsia="ko-KR"/>
+        </w:rPr>
+        <w:t xml:space="preserve"> Real-time chat </w:t>
+      </w:r>
+      <w:r>
+        <w:rPr>
+          <w:rFonts w:ascii="Aptos" w:eastAsia="Malgun Gothic" w:hAnsi="Aptos" w:cstheme="minorHAnsi"/>
+          <w:b/>
+          <w:bCs/>
+          <w:sz w:val="16"/>
+          <w:szCs w:val="16"/>
+          <w:lang w:eastAsia="ko-KR"/>
+        </w:rPr>
+        <w:t>platform</w:t>
+      </w:r>
+      <w:r>
+        <w:rPr>
+          <w:rFonts w:ascii="Aptos" w:eastAsia="Malgun Gothic" w:hAnsi="Aptos" w:cstheme="minorHAnsi"/>
+          <w:b/>
+          <w:bCs/>
+          <w:sz w:val="16"/>
+          <w:szCs w:val="16"/>
+          <w:lang w:eastAsia="ko-KR"/>
+        </w:rPr>
+        <w:t xml:space="preserve"> </w:t>
+      </w:r>
+      <w:r>
+        <w:rPr>
+          <w:rFonts w:ascii="Aptos" w:hAnsi="Aptos"/>
           <w:color w:val="000000"/>
           <w:sz w:val="16"/>
           <w:szCs w:val="16"/>
         </w:rPr>
-        <w:t>Home Automation</w:t>
+        <w:t xml:space="preserve">| </w:t>
       </w:r>
       <w:r>
         <w:rPr>
@@ -1682,17 +1802,9 @@
           <w:sz w:val="16"/>
           <w:szCs w:val="16"/>
         </w:rPr>
-        <w:t xml:space="preserve"> – </w:t>
-      </w:r>
-      <w:r>
-        <w:rPr>
-          <w:rFonts w:ascii="Aptos" w:eastAsia="Malgun Gothic" w:hAnsi="Aptos" w:cstheme="minorHAnsi"/>
-          <w:sz w:val="16"/>
-          <w:szCs w:val="16"/>
-          <w:lang w:eastAsia="ko-KR"/>
-        </w:rPr>
-        <w:t xml:space="preserve">Engineering </w:t>
-      </w:r>
+        <w:t>github.com/</w:t>
+      </w:r>
+      <w:proofErr w:type="spellStart"/>
       <w:r>
         <w:rPr>
           <w:rFonts w:ascii="Aptos" w:hAnsi="Aptos"/>
@@ -1700,8 +1812,29 @@
           <w:sz w:val="16"/>
           <w:szCs w:val="16"/>
         </w:rPr>
-        <w:t>Project</w:t>
-      </w:r>
+        <w:t>howardsun</w:t>
+      </w:r>
+      <w:proofErr w:type="spellEnd"/>
+      <w:r>
+        <w:rPr>
+          <w:rFonts w:ascii="Aptos" w:hAnsi="Aptos"/>
+          <w:color w:val="000000"/>
+          <w:sz w:val="16"/>
+          <w:szCs w:val="16"/>
+        </w:rPr>
+        <w:t>-dev/</w:t>
+      </w:r>
+      <w:proofErr w:type="spellStart"/>
+      <w:r>
+        <w:rPr>
+          <w:rFonts w:ascii="Aptos" w:hAnsi="Aptos"/>
+          <w:color w:val="000000"/>
+          <w:sz w:val="16"/>
+          <w:szCs w:val="16"/>
+        </w:rPr>
+        <w:t>quickchat</w:t>
+      </w:r>
+      <w:proofErr w:type="spellEnd"/>
     </w:p>
     <w:p>
       <w:pPr>
@@ -1721,6 +1854,161 @@
       </w:pPr>
       <w:r>
         <w:rPr>
+          <w:rFonts w:ascii="Aptos" w:eastAsia="Malgun Gothic" w:hAnsi="Aptos" w:cstheme="minorHAnsi"/>
+          <w:sz w:val="16"/>
+          <w:szCs w:val="16"/>
+          <w:lang w:eastAsia="ko-KR"/>
+        </w:rPr>
+        <w:t xml:space="preserve">Built a deployed real-time messaging platform using React, Node.js, Express, MongoDB, and Socket.IO with authentication, persistent chat data, and online/offline presence detection. Implemented </w:t>
+      </w:r>
+      <w:proofErr w:type="spellStart"/>
+      <w:r>
+        <w:rPr>
+          <w:rFonts w:ascii="Aptos" w:eastAsia="Malgun Gothic" w:hAnsi="Aptos" w:cstheme="minorHAnsi"/>
+          <w:sz w:val="16"/>
+          <w:szCs w:val="16"/>
+          <w:lang w:eastAsia="ko-KR"/>
+        </w:rPr>
+        <w:t>Zustand</w:t>
+      </w:r>
+      <w:proofErr w:type="spellEnd"/>
+      <w:r>
+        <w:rPr>
+          <w:rFonts w:ascii="Aptos" w:eastAsia="Malgun Gothic" w:hAnsi="Aptos" w:cstheme="minorHAnsi"/>
+          <w:sz w:val="16"/>
+          <w:szCs w:val="16"/>
+          <w:lang w:eastAsia="ko-KR"/>
+        </w:rPr>
+        <w:t xml:space="preserve"> for state management, optimistic UI updates, secure media uploads through </w:t>
+      </w:r>
+      <w:proofErr w:type="spellStart"/>
+      <w:r>
+        <w:rPr>
+          <w:rFonts w:ascii="Aptos" w:eastAsia="Malgun Gothic" w:hAnsi="Aptos" w:cstheme="minorHAnsi"/>
+          <w:sz w:val="16"/>
+          <w:szCs w:val="16"/>
+          <w:lang w:eastAsia="ko-KR"/>
+        </w:rPr>
+        <w:t>Cloudinary</w:t>
+      </w:r>
+      <w:proofErr w:type="spellEnd"/>
+      <w:r>
+        <w:rPr>
+          <w:rFonts w:ascii="Aptos" w:eastAsia="Malgun Gothic" w:hAnsi="Aptos" w:cstheme="minorHAnsi"/>
+          <w:sz w:val="16"/>
+          <w:szCs w:val="16"/>
+          <w:lang w:eastAsia="ko-KR"/>
+        </w:rPr>
+        <w:t xml:space="preserve">, and request protection/rate limiting with </w:t>
+      </w:r>
+      <w:proofErr w:type="spellStart"/>
+      <w:r>
+        <w:rPr>
+          <w:rFonts w:ascii="Aptos" w:eastAsia="Malgun Gothic" w:hAnsi="Aptos" w:cstheme="minorHAnsi"/>
+          <w:sz w:val="16"/>
+          <w:szCs w:val="16"/>
+          <w:lang w:eastAsia="ko-KR"/>
+        </w:rPr>
+        <w:t>Arcjet</w:t>
+      </w:r>
+      <w:proofErr w:type="spellEnd"/>
+      <w:r>
+        <w:rPr>
+          <w:rFonts w:ascii="Aptos" w:eastAsia="Malgun Gothic" w:hAnsi="Aptos" w:cstheme="minorHAnsi"/>
+          <w:sz w:val="16"/>
+          <w:szCs w:val="16"/>
+          <w:lang w:eastAsia="ko-KR"/>
+        </w:rPr>
+        <w:t>. Designed a responsive Tailwind CSS/</w:t>
+      </w:r>
+      <w:proofErr w:type="spellStart"/>
+      <w:r>
+        <w:rPr>
+          <w:rFonts w:ascii="Aptos" w:eastAsia="Malgun Gothic" w:hAnsi="Aptos" w:cstheme="minorHAnsi"/>
+          <w:sz w:val="16"/>
+          <w:szCs w:val="16"/>
+          <w:lang w:eastAsia="ko-KR"/>
+        </w:rPr>
+        <w:t>DaisyUI</w:t>
+      </w:r>
+      <w:proofErr w:type="spellEnd"/>
+      <w:r>
+        <w:rPr>
+          <w:rFonts w:ascii="Aptos" w:eastAsia="Malgun Gothic" w:hAnsi="Aptos" w:cstheme="minorHAnsi"/>
+          <w:sz w:val="16"/>
+          <w:szCs w:val="16"/>
+          <w:lang w:eastAsia="ko-KR"/>
+        </w:rPr>
+        <w:t xml:space="preserve"> interface for desktop and mobile users.</w:t>
+      </w:r>
+    </w:p>
+    <w:p>
+      <w:pPr>
+        <w:spacing w:line="259" w:lineRule="auto"/>
+        <w:rPr>
+          <w:rFonts w:ascii="Aptos" w:hAnsi="Aptos"/>
+          <w:color w:val="000000"/>
+          <w:sz w:val="16"/>
+          <w:szCs w:val="16"/>
+        </w:rPr>
+      </w:pPr>
+      <w:r>
+        <w:rPr>
+          <w:rFonts w:ascii="Aptos" w:hAnsi="Aptos"/>
+          <w:b/>
+          <w:bCs/>
+          <w:color w:val="000000"/>
+          <w:sz w:val="16"/>
+          <w:szCs w:val="16"/>
+        </w:rPr>
+        <w:t>Home Automation</w:t>
+      </w:r>
+      <w:r>
+        <w:rPr>
+          <w:rFonts w:ascii="Aptos" w:hAnsi="Aptos"/>
+          <w:color w:val="000000"/>
+          <w:sz w:val="16"/>
+          <w:szCs w:val="16"/>
+        </w:rPr>
+        <w:t xml:space="preserve"> – </w:t>
+      </w:r>
+      <w:r>
+        <w:rPr>
+          <w:rFonts w:ascii="Aptos" w:eastAsia="Malgun Gothic" w:hAnsi="Aptos" w:cstheme="minorHAnsi"/>
+          <w:sz w:val="16"/>
+          <w:szCs w:val="16"/>
+          <w:lang w:eastAsia="ko-KR"/>
+        </w:rPr>
+        <w:t xml:space="preserve">Engineering </w:t>
+      </w:r>
+      <w:r>
+        <w:rPr>
+          <w:rFonts w:ascii="Aptos" w:hAnsi="Aptos"/>
+          <w:color w:val="000000"/>
+          <w:sz w:val="16"/>
+          <w:szCs w:val="16"/>
+        </w:rPr>
+        <w:t>Project</w:t>
+      </w:r>
+    </w:p>
+    <w:p>
+      <w:pPr>
+        <w:pStyle w:val="ListParagraph"/>
+        <w:numPr>
+          <w:ilvl w:val="0"/>
+          <w:numId w:val="14"/>
+        </w:numPr>
+        <w:spacing w:line="259" w:lineRule="auto"/>
+        <w:ind w:left="270" w:hanging="180"/>
+        <w:rPr>
+          <w:rFonts w:ascii="Aptos" w:eastAsia="Malgun Gothic" w:hAnsi="Aptos" w:cstheme="minorHAnsi"/>
+          <w:sz w:val="16"/>
+          <w:szCs w:val="16"/>
+          <w:lang w:eastAsia="ko-KR"/>
+        </w:rPr>
+      </w:pPr>
+      <w:r>
+        <w:rPr>
           <w:rFonts w:ascii="Aptos" w:eastAsia="Times New Roman" w:hAnsi="Aptos" w:cs="Arial"/>
           <w:color w:val="000000"/>
           <w:kern w:val="0"/>
@@ -1728,7 +2016,7 @@
           <w:szCs w:val="16"/>
           <w14:ligatures w14:val="none"/>
         </w:rPr>
-        <w:t>Engineered a home automation system using Raspberry Pi and Arduino, programmed in C++ for low-level control and performance. Integrated subsystems like automatic blind control with precise timing and PWM. Optimized memory and code execution for smooth operation, increasing home energy efficiency by 10%</w:t>
+        <w:t>Built a Raspberry Pi and Arduino-based home automation system using C++ for low-level device control. Integrated subsystems for automated blind control, timing-based routines, and PWM-driven hardware behavior. Optimized memory usage and control logic for reliable long-running operation.</w:t>
       </w:r>
     </w:p>
     <w:p>

</xml_diff>